<commit_message>
fix: add yaml generation on data-contract generation, refactor payload for data-contract
</commit_message>
<xml_diff>
--- a/src/server/templates/data-contract.docx
+++ b/src/server/templates/data-contract.docx
@@ -24727,14 +24727,17 @@
       <w:pStyle w:val="header"/>
       <w:bidi w:val="0"/>
       <w:ind w:left="0" w:right="0" w:firstLine="0"/>
-      <w:jc w:val="right"/>
+      <w:jc w:val="left"/>
       <w:rPr>
         <w:rtl w:val="0"/>
       </w:rPr>
     </w:pPr>
     <w:r>
-      <w:tab/>
-      <w:tab/>
+      <w:rPr>
+        <w:rStyle w:val="Aucun"/>
+        <w:rtl w:val="0"/>
+      </w:rPr>
+      <w:t xml:space="preserve">Version {version}</w:t>
     </w:r>
   </w:p>
 </w:hdr>

</xml_diff>